<commit_message>
docs: complete component-level SRS traceability and wireframes
</commit_message>
<xml_diff>
--- a/docs/srs/SRS.docx
+++ b/docs/srs/SRS.docx
@@ -3952,6 +3952,507 @@
       </w:pPr>
       <w:r>
         <w:t xml:space="preserve">The Drive Gateway also dispatches the e-signature sub-router for /api/documents, /api/envelopes, and /api/sign/* when ESIGN_MODULE_ENABLED=true; the route family includes authenticated envelope creation/status/void/retry/resync, signer open/status/evidence/PDF/verify/submit/decline operations. The grant crawler is a separate Worker and must not be represented as a Drive Gateway route. The frontend health endpoint is also a separate Worker. HTTP methods for wildcard/delegated routes must be confirmed against their handler implementation and tests before generating a formal OpenAPI contract.</w:t>
+      </w:r>
+    </w:p>
+    <w:p/>
+    <w:p/>
+    <w:p>
+      <w:pPr>
+        <w:pStyle w:val="Heading1"/>
+      </w:pPr>
+      <w:r>
+        <w:t xml:space="preserve">Appendix D — Source page-component to wireframe traceability</w:t>
+      </w:r>
+    </w:p>
+    <w:p>
+      <w:pPr>
+        <w:pStyle w:val="Normal"/>
+      </w:pPr>
+      <w:r>
+        <w:t xml:space="preserve">The repository contains 41 JSX page components under src/pages/ (including the fundraising subfolder). Components that share a top-level portal intentionally reuse its portal wireframe; distinct operational/activation screens have a dedicated M-* wireframe. This avoids inventing additional top-level navigation entries while ensuring every source page component is traceable.</w:t>
+      </w:r>
+    </w:p>
+    <w:p/>
+    <w:p>
+      <w:pPr>
+        <w:pStyle w:val="Normal"/>
+      </w:pPr>
+      <w:r>
+        <w:t xml:space="preserve">| Source page component | Wireframe page ID |</w:t>
+      </w:r>
+    </w:p>
+    <w:p>
+      <w:pPr>
+        <w:pStyle w:val="Normal"/>
+      </w:pPr>
+      <w:r>
+        <w:t xml:space="preserve">|---|---|</w:t>
+      </w:r>
+    </w:p>
+    <w:p>
+      <w:pPr>
+        <w:pStyle w:val="Normal"/>
+      </w:pPr>
+      <w:r>
+        <w:t xml:space="preserve">| src/pages/AddAdministratorPortal.jsx | P-ADD-ADMINISTRATOR |</w:t>
+      </w:r>
+    </w:p>
+    <w:p>
+      <w:pPr>
+        <w:pStyle w:val="Normal"/>
+      </w:pPr>
+      <w:r>
+        <w:t xml:space="preserve">| src/pages/AuditorsSpecialInvitees.jsx | P-AUDITORS-AND-SPECIAL-INVITEES |</w:t>
+      </w:r>
+    </w:p>
+    <w:p>
+      <w:pPr>
+        <w:pStyle w:val="Normal"/>
+      </w:pPr>
+      <w:r>
+        <w:t xml:space="preserve">| src/pages/AuthorizationApprovals.jsx | P-AUTHORIZATION-AND-APPROVALS |</w:t>
+      </w:r>
+    </w:p>
+    <w:p>
+      <w:pPr>
+        <w:pStyle w:val="Normal"/>
+      </w:pPr>
+      <w:r>
+        <w:t xml:space="preserve">| src/pages/AuthorizationWorkflow.jsx | M-AUTHORIZATION-WORKFLOW |</w:t>
+      </w:r>
+    </w:p>
+    <w:p>
+      <w:pPr>
+        <w:pStyle w:val="Normal"/>
+      </w:pPr>
+      <w:r>
+        <w:t xml:space="preserve">| src/pages/BoardMembers.jsx | P-BOARD-MEMBERS-REGISTRATION |</w:t>
+      </w:r>
+    </w:p>
+    <w:p>
+      <w:pPr>
+        <w:pStyle w:val="Normal"/>
+      </w:pPr>
+      <w:r>
+        <w:t xml:space="preserve">| src/pages/CommunicationMediaOperations.jsx | M-COMMUNICATION-MEDIA-OPERATIONS |</w:t>
+      </w:r>
+    </w:p>
+    <w:p>
+      <w:pPr>
+        <w:pStyle w:val="Normal"/>
+      </w:pPr>
+      <w:r>
+        <w:t xml:space="preserve">| src/pages/CommunicationMediaPortal.jsx | P-COMMUNICATION-AND-MEDIA |</w:t>
+      </w:r>
+    </w:p>
+    <w:p>
+      <w:pPr>
+        <w:pStyle w:val="Normal"/>
+      </w:pPr>
+      <w:r>
+        <w:t xml:space="preserve">| src/pages/CommunicationMediaStudio.jsx | M-COMMUNICATION-MEDIA-STUDIO |</w:t>
+      </w:r>
+    </w:p>
+    <w:p>
+      <w:pPr>
+        <w:pStyle w:val="Normal"/>
+      </w:pPr>
+      <w:r>
+        <w:t xml:space="preserve">| src/pages/CommunicationsConnectionsFunding.jsx | M-COMMUNICATIONS-CONNECTIONS-FUNDING |</w:t>
+      </w:r>
+    </w:p>
+    <w:p>
+      <w:pPr>
+        <w:pStyle w:val="Normal"/>
+      </w:pPr>
+      <w:r>
+        <w:t xml:space="preserve">| src/pages/CommunicationsSocialStudio.jsx | M-COMMUNICATIONS-SOCIAL-STUDIO |</w:t>
+      </w:r>
+    </w:p>
+    <w:p>
+      <w:pPr>
+        <w:pStyle w:val="Normal"/>
+      </w:pPr>
+      <w:r>
+        <w:t xml:space="preserve">| src/pages/CommunicationsWebsiteStudio.jsx | M-COMMUNICATIONS-WEBSITE-STUDIO |</w:t>
+      </w:r>
+    </w:p>
+    <w:p>
+      <w:pPr>
+        <w:pStyle w:val="Normal"/>
+      </w:pPr>
+      <w:r>
+        <w:t xml:space="preserve">| src/pages/CredentialInterview.jsx | M-CREDENTIAL-INTERVIEW |</w:t>
+      </w:r>
+    </w:p>
+    <w:p>
+      <w:pPr>
+        <w:pStyle w:val="Normal"/>
+      </w:pPr>
+      <w:r>
+        <w:t xml:space="preserve">| src/pages/DocumentLifecycleModule.jsx | P-DOCUMENTS |</w:t>
+      </w:r>
+    </w:p>
+    <w:p>
+      <w:pPr>
+        <w:pStyle w:val="Normal"/>
+      </w:pPr>
+      <w:r>
+        <w:t xml:space="preserve">| src/pages/EmployeePayments.jsx | P-EMPLOYEE-PAYMENTS |</w:t>
+      </w:r>
+    </w:p>
+    <w:p>
+      <w:pPr>
+        <w:pStyle w:val="Normal"/>
+      </w:pPr>
+      <w:r>
+        <w:t xml:space="preserve">| src/pages/Employees.jsx | P-MEMBERS-AND-PERSONNEL |</w:t>
+      </w:r>
+    </w:p>
+    <w:p>
+      <w:pPr>
+        <w:pStyle w:val="Normal"/>
+      </w:pPr>
+      <w:r>
+        <w:t xml:space="preserve">| src/pages/ExternalAuditorPortal.jsx | P-EXTERNAL-AUDITOR-PORTAL |</w:t>
+      </w:r>
+    </w:p>
+    <w:p>
+      <w:pPr>
+        <w:pStyle w:val="Normal"/>
+      </w:pPr>
+      <w:r>
+        <w:t xml:space="preserve">| src/pages/FinancePortfolio.jsx | P-FINANCE-PORTFOLIO |</w:t>
+      </w:r>
+    </w:p>
+    <w:p>
+      <w:pPr>
+        <w:pStyle w:val="Normal"/>
+      </w:pPr>
+      <w:r>
+        <w:t xml:space="preserve">| src/pages/GatewaySigningPortal.jsx | M-GATEWAY-SIGNING-PORTAL |</w:t>
+      </w:r>
+    </w:p>
+    <w:p>
+      <w:pPr>
+        <w:pStyle w:val="Normal"/>
+      </w:pPr>
+      <w:r>
+        <w:t xml:space="preserve">| src/pages/GovernanceWorkspaces.jsx | P-DASHBOARD |</w:t>
+      </w:r>
+    </w:p>
+    <w:p>
+      <w:pPr>
+        <w:pStyle w:val="Normal"/>
+      </w:pPr>
+      <w:r>
+        <w:t xml:space="preserve">| src/pages/GrantIntelligencePortal.jsx | P-GRANT-INTELLIGENCE-AND-FUNDING-OPPORTUNITIES |</w:t>
+      </w:r>
+    </w:p>
+    <w:p>
+      <w:pPr>
+        <w:pStyle w:val="Normal"/>
+      </w:pPr>
+      <w:r>
+        <w:t xml:space="preserve">| src/pages/ITOperationsPortal.jsx | P-IT-OPERATIONS |</w:t>
+      </w:r>
+    </w:p>
+    <w:p>
+      <w:pPr>
+        <w:pStyle w:val="Normal"/>
+      </w:pPr>
+      <w:r>
+        <w:t xml:space="preserve">| src/pages/InductionAdmin.jsx | P-INDUCTION-APPLICATIONS |</w:t>
+      </w:r>
+    </w:p>
+    <w:p>
+      <w:pPr>
+        <w:pStyle w:val="Normal"/>
+      </w:pPr>
+      <w:r>
+        <w:t xml:space="preserve">| src/pages/InductionOrientation.jsx | P-INDUCTION-AND-ORIENTATION |</w:t>
+      </w:r>
+    </w:p>
+    <w:p>
+      <w:pPr>
+        <w:pStyle w:val="Normal"/>
+      </w:pPr>
+      <w:r>
+        <w:t xml:space="preserve">| src/pages/InvitationActivation.jsx | M-INVITATION-ACTIVATION |</w:t>
+      </w:r>
+    </w:p>
+    <w:p>
+      <w:pPr>
+        <w:pStyle w:val="Normal"/>
+      </w:pPr>
+      <w:r>
+        <w:t xml:space="preserve">| src/pages/Invitations.jsx | P-INVITATIONS |</w:t>
+      </w:r>
+    </w:p>
+    <w:p>
+      <w:pPr>
+        <w:pStyle w:val="Normal"/>
+      </w:pPr>
+      <w:r>
+        <w:t xml:space="preserve">| src/pages/MeetingEntryGateway.jsx | M-MEETING-ENTRY-GATEWAY |</w:t>
+      </w:r>
+    </w:p>
+    <w:p>
+      <w:pPr>
+        <w:pStyle w:val="Normal"/>
+      </w:pPr>
+      <w:r>
+        <w:t xml:space="preserve">| src/pages/MeetingRoom.jsx | SP-MEETINGS-MEETING-ROOM |</w:t>
+      </w:r>
+    </w:p>
+    <w:p>
+      <w:pPr>
+        <w:pStyle w:val="Normal"/>
+      </w:pPr>
+      <w:r>
+        <w:t xml:space="preserve">| src/pages/Meetings.jsx | P-MEETINGS |</w:t>
+      </w:r>
+    </w:p>
+    <w:p>
+      <w:pPr>
+        <w:pStyle w:val="Normal"/>
+      </w:pPr>
+      <w:r>
+        <w:t xml:space="preserve">| src/pages/Members.jsx | P-MEMBERS-AND-PERSONNEL |</w:t>
+      </w:r>
+    </w:p>
+    <w:p>
+      <w:pPr>
+        <w:pStyle w:val="Normal"/>
+      </w:pPr>
+      <w:r>
+        <w:t xml:space="preserve">| src/pages/OperationalGateways.jsx | M-OPERATIONAL-GATEWAYS |</w:t>
+      </w:r>
+    </w:p>
+    <w:p>
+      <w:pPr>
+        <w:pStyle w:val="Normal"/>
+      </w:pPr>
+      <w:r>
+        <w:t xml:space="preserve">| src/pages/OperationalGatewaysParticipants.jsx | M-OPERATIONAL-GATEWAYS-PARTICIPANTS |</w:t>
+      </w:r>
+    </w:p>
+    <w:p>
+      <w:pPr>
+        <w:pStyle w:val="Normal"/>
+      </w:pPr>
+      <w:r>
+        <w:t xml:space="preserve">| src/pages/ProcurementPortal.jsx | P-PROCUREMENT |</w:t>
+      </w:r>
+    </w:p>
+    <w:p>
+      <w:pPr>
+        <w:pStyle w:val="Normal"/>
+      </w:pPr>
+      <w:r>
+        <w:t xml:space="preserve">| src/pages/ResearchStatisticsKnowledgePortal.jsx | P-RESEARCH-STATISTICS-AND-KNOWLEDGE |</w:t>
+      </w:r>
+    </w:p>
+    <w:p>
+      <w:pPr>
+        <w:pStyle w:val="Normal"/>
+      </w:pPr>
+      <w:r>
+        <w:t xml:space="preserve">| src/pages/Resolutions.jsx | P-RESOLUTIONS |</w:t>
+      </w:r>
+    </w:p>
+    <w:p>
+      <w:pPr>
+        <w:pStyle w:val="Normal"/>
+      </w:pPr>
+      <w:r>
+        <w:t xml:space="preserve">| src/pages/Settings.jsx | P-SETTINGS |</w:t>
+      </w:r>
+    </w:p>
+    <w:p>
+      <w:pPr>
+        <w:pStyle w:val="Normal"/>
+      </w:pPr>
+      <w:r>
+        <w:t xml:space="preserve">| src/pages/SignaturePlatform.jsx | P-SIGNATURE-PLATFORM |</w:t>
+      </w:r>
+    </w:p>
+    <w:p>
+      <w:pPr>
+        <w:pStyle w:val="Normal"/>
+      </w:pPr>
+      <w:r>
+        <w:t xml:space="preserve">| src/pages/SignaturePlatformWithUpload.jsx | P-SIGNATURE-PLATFORM |</w:t>
+      </w:r>
+    </w:p>
+    <w:p>
+      <w:pPr>
+        <w:pStyle w:val="Normal"/>
+      </w:pPr>
+      <w:r>
+        <w:t xml:space="preserve">| src/pages/SocialMediaAccounts.jsx | M-SOCIAL-MEDIA-ACCOUNTS |</w:t>
+      </w:r>
+    </w:p>
+    <w:p>
+      <w:pPr>
+        <w:pStyle w:val="Normal"/>
+      </w:pPr>
+      <w:r>
+        <w:t xml:space="preserve">| src/pages/Voting.jsx | P-VOTING |</w:t>
+      </w:r>
+    </w:p>
+    <w:p>
+      <w:pPr>
+        <w:pStyle w:val="Normal"/>
+      </w:pPr>
+      <w:r>
+        <w:t xml:space="preserve">| src/pages/WorkflowEngines.jsx | M-WORKFLOW-ENGINES |</w:t>
+      </w:r>
+    </w:p>
+    <w:p>
+      <w:pPr>
+        <w:pStyle w:val="Normal"/>
+      </w:pPr>
+      <w:r>
+        <w:t xml:space="preserve">| src/pages/grant-fundraising/FundraisingSourceRegistry.jsx | M-FUNDRAISING-SOURCE-REGISTRY |</w:t>
+      </w:r>
+    </w:p>
+    <w:p/>
+    <w:p>
+      <w:pPr>
+        <w:pStyle w:val="Heading2"/>
+      </w:pPr>
+      <w:r>
+        <w:t xml:space="preserve">D.1 Additional subsystem component screens</w:t>
+      </w:r>
+    </w:p>
+    <w:p>
+      <w:pPr>
+        <w:pStyle w:val="Normal"/>
+      </w:pPr>
+      <w:r>
+        <w:t xml:space="preserve">The following component-level capabilities are represented by dedicated wireframes in addition to the 41 source page components:</w:t>
+      </w:r>
+    </w:p>
+    <w:p>
+      <w:pPr>
+        <w:pStyle w:val="Normal"/>
+      </w:pPr>
+      <w:r>
+        <w:t xml:space="preserve">- M-RESEARCH-DATA-COLLECTION — Research Data Collection Studio.</w:t>
+      </w:r>
+    </w:p>
+    <w:p>
+      <w:pPr>
+        <w:pStyle w:val="Normal"/>
+      </w:pPr>
+      <w:r>
+        <w:t xml:space="preserve">- M-DATASET-REGISTRY — Dataset Registry (subsystem screen; distinct page identity is not a top-level NAV item).</w:t>
+      </w:r>
+    </w:p>
+    <w:p>
+      <w:pPr>
+        <w:pStyle w:val="Normal"/>
+      </w:pPr>
+      <w:r>
+        <w:t xml:space="preserve">- M-RELEASE-READINESS — Release Readiness component.</w:t>
+      </w:r>
+    </w:p>
+    <w:p>
+      <w:pPr>
+        <w:pStyle w:val="Normal"/>
+      </w:pPr>
+      <w:r>
+        <w:t xml:space="preserve">- M-SIGNATURE-PATHWAY-SELF-TEST — Signature Pathway Self-Test.</w:t>
+      </w:r>
+    </w:p>
+    <w:p>
+      <w:pPr>
+        <w:pStyle w:val="Normal"/>
+      </w:pPr>
+      <w:r>
+        <w:t xml:space="preserve">- M-STATISTICAL-ANALYSIS-WORKBENCH — Statistical Analysis Workbench.</w:t>
+      </w:r>
+    </w:p>
+    <w:p>
+      <w:pPr>
+        <w:pStyle w:val="Normal"/>
+      </w:pPr>
+      <w:r>
+        <w:t xml:space="preserve">- M-RESEARCH-EVIDENCE-EXCHANGE — Research Evidence Exchange.</w:t>
+      </w:r>
+    </w:p>
+    <w:p>
+      <w:pPr>
+        <w:pStyle w:val="Normal"/>
+      </w:pPr>
+      <w:r>
+        <w:t xml:space="preserve">- X-SIGNATURE-PAD — Signature field confirmation pad.</w:t>
+      </w:r>
+    </w:p>
+    <w:p>
+      <w:pPr>
+        <w:pStyle w:val="Normal"/>
+      </w:pPr>
+      <w:r>
+        <w:t xml:space="preserve">- X-UPLOAD-FLOW — Controlled upload workflow.</w:t>
+      </w:r>
+    </w:p>
+    <w:p>
+      <w:pPr>
+        <w:pStyle w:val="Normal"/>
+      </w:pPr>
+      <w:r>
+        <w:t xml:space="preserve">- X-INVITATION-FLOW — Invitation and account activation workflow.</w:t>
+      </w:r>
+    </w:p>
+    <w:p/>
+    <w:p>
+      <w:pPr>
+        <w:pStyle w:val="Heading2"/>
+      </w:pPr>
+      <w:r>
+        <w:t xml:space="preserve">D.2 Wireframe package counts</w:t>
+      </w:r>
+    </w:p>
+    <w:p>
+      <w:pPr>
+        <w:pStyle w:val="Normal"/>
+      </w:pPr>
+      <w:r>
+        <w:t xml:space="preserve">- 31 top-level NAV modules.</w:t>
+      </w:r>
+    </w:p>
+    <w:p>
+      <w:pPr>
+        <w:pStyle w:val="Normal"/>
+      </w:pPr>
+      <w:r>
+        <w:t xml:space="preserve">- 15 registered nested sub-portals.</w:t>
+      </w:r>
+    </w:p>
+    <w:p>
+      <w:pPr>
+        <w:pStyle w:val="Normal"/>
+      </w:pPr>
+      <w:r>
+        <w:t xml:space="preserve">- 21 additional source-component/subsystem wireframes.</w:t>
+      </w:r>
+    </w:p>
+    <w:p>
+      <w:pPr>
+        <w:pStyle w:val="Normal"/>
+      </w:pPr>
+      <w:r>
+        <w:t xml:space="preserve">- 5 shared shell/authentication/workflow wireframes.</w:t>
+      </w:r>
+    </w:p>
+    <w:p>
+      <w:pPr>
+        <w:pStyle w:val="Normal"/>
+      </w:pPr>
+      <w:r>
+        <w:t xml:space="preserve">- 72 HTML wireframes, plus this index; one PDF bundle contains 72 page-specific wireframe summaries.</w:t>
       </w:r>
     </w:p>
     <w:p/>

</xml_diff>